<commit_message>
Fixtures: C and D quote all-in so three suppliers are comparable; B and E stay freight-only
</commit_message>
<xml_diff>
--- a/data/vendor_docs/vendor-C-word-prose.docx
+++ b/data/vendor_docs/vendor-C-word-prose.docx
@@ -26,7 +26,7 @@
     </w:p>
     <w:p>
       <w:r>
-        <w:t xml:space="preserve">Thank you for your enquiry for annual freight lanes. We are pleased to offer the following rates in Indian Rupees. All ocean rates include terminal handling at origin and documentation; destination terminal handling and any BAF/CAF adjustment after 31 December 2026 will be charged at actuals. Air rates include origin handling. Rates are valid for 60 days.</w:t>
+        <w:t xml:space="preserve">Thank you for your enquiry for annual freight lanes. We are pleased to offer the following rates in Indian Rupees. All ocean and air rates are all-in port to port: terminal handling at both ends, BAF/CAF and documentation are included. Customs clearance and duties are excluded. Rates are valid for 60 days.</w:t>
       </w:r>
     </w:p>
     <w:p>
@@ -39,87 +39,87 @@
     </w:p>
     <w:p>
       <w:r>
-        <w:t xml:space="preserve">For Nhava Sheva – Jebel Ali we can offer INR 45,200 per twenty-foot standard container including THC at origin, transit approximately 9 days, 10 free days at destination.</w:t>
-      </w:r>
-    </w:p>
-    <w:p>
-      <w:r>
-        <w:t xml:space="preserve">For Nhava Sheva – Jebel Ali we can offer INR 69,800 per forty-foot high cube container including THC at origin, transit approximately 9 days, 10 free days at destination.</w:t>
-      </w:r>
-    </w:p>
-    <w:p>
-      <w:r>
-        <w:t xml:space="preserve">For Mundra – Jebel Ali we can offer INR 43,500 per twenty-foot standard container including THC at origin, transit approximately 8 days, 10 free days at destination.</w:t>
-      </w:r>
-    </w:p>
-    <w:p>
-      <w:r>
-        <w:t xml:space="preserve">For Mundra – Jebel Ali we can offer INR 67,100 per forty-foot high cube container including THC at origin, transit approximately 8 days, 10 free days at destination.</w:t>
-      </w:r>
-    </w:p>
-    <w:p>
-      <w:r>
-        <w:t xml:space="preserve">For Nhava Sheva – Singapore we can offer INR 37,400 per twenty-foot standard container including THC at origin, transit approximately 14 days, 10 free days at destination.</w:t>
-      </w:r>
-    </w:p>
-    <w:p>
-      <w:r>
-        <w:t xml:space="preserve">For Nhava Sheva – Singapore we can offer INR 56,100 per forty-foot high cube container including THC at origin, transit approximately 14 days, 10 free days at destination.</w:t>
-      </w:r>
-    </w:p>
-    <w:p>
-      <w:r>
-        <w:t xml:space="preserve">For Nhava Sheva – Rotterdam we can offer INR 1,59,800 per forty-foot high cube container including THC at origin, transit approximately 28 days, 10 free days at destination.</w:t>
-      </w:r>
-    </w:p>
-    <w:p>
-      <w:r>
-        <w:t xml:space="preserve">For Mundra – Rotterdam we can offer INR 1,57,000 per forty-foot high cube container including THC at origin, transit approximately 29 days, 10 free days at destination.</w:t>
-      </w:r>
-    </w:p>
-    <w:p>
-      <w:r>
-        <w:t xml:space="preserve">For Nhava Sheva – Los Angeles we can offer INR 2,29,000 per forty-foot high cube container including THC at origin, transit approximately 36 days, 10 free days at destination.</w:t>
-      </w:r>
-    </w:p>
-    <w:p>
-      <w:r>
-        <w:t xml:space="preserve">For Chennai – Singapore we can offer INR 33,100 per twenty-foot standard container including THC at origin, transit approximately 11 days, 10 free days at destination.</w:t>
-      </w:r>
-    </w:p>
-    <w:p>
-      <w:r>
-        <w:t xml:space="preserve">For Nhava Sheva – Hamburg we can offer INR 1,64,000 per forty-foot high cube container including THC at origin, transit approximately 30 days, 10 free days at destination.</w:t>
-      </w:r>
-    </w:p>
-    <w:p>
-      <w:r>
-        <w:t xml:space="preserve">For Nhava Sheva – Felixstowe we can offer INR 1,67,500 per forty-foot high cube container including THC at origin, transit approximately 29 days, 10 free days at destination.</w:t>
-      </w:r>
-    </w:p>
-    <w:p>
-      <w:r>
-        <w:t xml:space="preserve">For Nhava Sheva – Colombo we can offer INR 22,300 per twenty-foot standard container including THC at origin, transit approximately 6 days, 10 free days at destination.</w:t>
-      </w:r>
-    </w:p>
-    <w:p>
-      <w:r>
-        <w:t xml:space="preserve">For Shanghai – Nhava Sheva (import) we can offer INR 95,900 per forty-foot high cube container including THC at origin, transit approximately 16 days, 10 free days at destination.</w:t>
-      </w:r>
-    </w:p>
-    <w:p>
-      <w:r>
-        <w:t xml:space="preserve">For Shanghai – Nhava Sheva (import) we can offer INR 57,200 per twenty-foot standard container including THC at origin, transit approximately 16 days, 10 free days at destination.</w:t>
-      </w:r>
-    </w:p>
-    <w:p>
-      <w:r>
-        <w:t xml:space="preserve">For Busan – Chennai (import) we can offer INR 91,800 per forty-foot high cube container including THC at origin, transit approximately 18 days, 10 free days at destination.</w:t>
-      </w:r>
-    </w:p>
-    <w:p>
-      <w:r>
-        <w:t xml:space="preserve">For Jebel Ali – Mundra (import) we can offer INR 34,900 per twenty-foot standard container including THC at origin, transit approximately 10 days, 10 free days at destination.</w:t>
+        <w:t xml:space="preserve">For Nhava Sheva – Jebel Ali we can offer INR 45,200 per twenty-foot standard container all-in, transit approximately 9 days, 10 free days at destination.</w:t>
+      </w:r>
+    </w:p>
+    <w:p>
+      <w:r>
+        <w:t xml:space="preserve">For Nhava Sheva – Jebel Ali we can offer INR 69,800 per forty-foot high cube container all-in, transit approximately 9 days, 10 free days at destination.</w:t>
+      </w:r>
+    </w:p>
+    <w:p>
+      <w:r>
+        <w:t xml:space="preserve">For Mundra – Jebel Ali we can offer INR 43,500 per twenty-foot standard container all-in, transit approximately 8 days, 10 free days at destination.</w:t>
+      </w:r>
+    </w:p>
+    <w:p>
+      <w:r>
+        <w:t xml:space="preserve">For Mundra – Jebel Ali we can offer INR 67,100 per forty-foot high cube container all-in, transit approximately 8 days, 10 free days at destination.</w:t>
+      </w:r>
+    </w:p>
+    <w:p>
+      <w:r>
+        <w:t xml:space="preserve">For Nhava Sheva – Singapore we can offer INR 37,400 per twenty-foot standard container all-in, transit approximately 14 days, 10 free days at destination.</w:t>
+      </w:r>
+    </w:p>
+    <w:p>
+      <w:r>
+        <w:t xml:space="preserve">For Nhava Sheva – Singapore we can offer INR 56,100 per forty-foot high cube container all-in, transit approximately 14 days, 10 free days at destination.</w:t>
+      </w:r>
+    </w:p>
+    <w:p>
+      <w:r>
+        <w:t xml:space="preserve">For Nhava Sheva – Rotterdam we can offer INR 1,59,800 per forty-foot high cube container all-in, transit approximately 28 days, 10 free days at destination.</w:t>
+      </w:r>
+    </w:p>
+    <w:p>
+      <w:r>
+        <w:t xml:space="preserve">For Mundra – Rotterdam we can offer INR 1,57,000 per forty-foot high cube container all-in, transit approximately 29 days, 10 free days at destination.</w:t>
+      </w:r>
+    </w:p>
+    <w:p>
+      <w:r>
+        <w:t xml:space="preserve">For Nhava Sheva – Los Angeles we can offer INR 2,29,000 per forty-foot high cube container all-in, transit approximately 36 days, 10 free days at destination.</w:t>
+      </w:r>
+    </w:p>
+    <w:p>
+      <w:r>
+        <w:t xml:space="preserve">For Chennai – Singapore we can offer INR 33,100 per twenty-foot standard container all-in, transit approximately 11 days, 10 free days at destination.</w:t>
+      </w:r>
+    </w:p>
+    <w:p>
+      <w:r>
+        <w:t xml:space="preserve">For Nhava Sheva – Hamburg we can offer INR 1,64,000 per forty-foot high cube container all-in, transit approximately 30 days, 10 free days at destination.</w:t>
+      </w:r>
+    </w:p>
+    <w:p>
+      <w:r>
+        <w:t xml:space="preserve">For Nhava Sheva – Felixstowe we can offer INR 1,67,500 per forty-foot high cube container all-in, transit approximately 29 days, 10 free days at destination.</w:t>
+      </w:r>
+    </w:p>
+    <w:p>
+      <w:r>
+        <w:t xml:space="preserve">For Nhava Sheva – Colombo we can offer INR 22,300 per twenty-foot standard container all-in, transit approximately 6 days, 10 free days at destination.</w:t>
+      </w:r>
+    </w:p>
+    <w:p>
+      <w:r>
+        <w:t xml:space="preserve">For Shanghai – Nhava Sheva (import) we can offer INR 95,900 per forty-foot high cube container all-in, transit approximately 16 days, 10 free days at destination.</w:t>
+      </w:r>
+    </w:p>
+    <w:p>
+      <w:r>
+        <w:t xml:space="preserve">For Shanghai – Nhava Sheva (import) we can offer INR 57,200 per twenty-foot standard container all-in, transit approximately 16 days, 10 free days at destination.</w:t>
+      </w:r>
+    </w:p>
+    <w:p>
+      <w:r>
+        <w:t xml:space="preserve">For Busan – Chennai (import) we can offer INR 91,800 per forty-foot high cube container all-in, transit approximately 18 days, 10 free days at destination.</w:t>
+      </w:r>
+    </w:p>
+    <w:p>
+      <w:r>
+        <w:t xml:space="preserve">For Jebel Ali – Mundra (import) we can offer INR 34,900 per twenty-foot standard container all-in, transit approximately 10 days, 10 free days at destination.</w:t>
       </w:r>
     </w:p>
     <w:p>
@@ -132,37 +132,37 @@
     </w:p>
     <w:p>
       <w:r>
-        <w:t xml:space="preserve">For LCL Nhava Sheva – Jebel Ali our rate is INR 1,990 per cubic metre, minimum one cubic metre, including origin CFS charges and documentation.</w:t>
-      </w:r>
-    </w:p>
-    <w:p>
-      <w:r>
-        <w:t xml:space="preserve">For LCL Nhava Sheva – Singapore our rate is INR 2,490 per cubic metre, minimum one cubic metre, including origin CFS charges and documentation.</w:t>
-      </w:r>
-    </w:p>
-    <w:p>
-      <w:r>
-        <w:t xml:space="preserve">For LCL Chennai – Singapore our rate is INR 2,320 per cubic metre, minimum one cubic metre, including origin CFS charges and documentation.</w:t>
-      </w:r>
-    </w:p>
-    <w:p>
-      <w:r>
-        <w:t xml:space="preserve">For LCL Nhava Sheva – Rotterdam our rate is INR 3,950 per cubic metre, minimum one cubic metre, including origin CFS charges and documentation.</w:t>
-      </w:r>
-    </w:p>
-    <w:p>
-      <w:r>
-        <w:t xml:space="preserve">For LCL Mundra – Hamburg our rate is INR 3,860 per cubic metre, minimum one cubic metre, including origin CFS charges and documentation.</w:t>
-      </w:r>
-    </w:p>
-    <w:p>
-      <w:r>
-        <w:t xml:space="preserve">For LCL Singapore – Nhava Sheva (import) our rate is INR 2,640 per cubic metre, minimum one cubic metre, including origin CFS charges and documentation.</w:t>
-      </w:r>
-    </w:p>
-    <w:p>
-      <w:r>
-        <w:t xml:space="preserve">For LCL Shanghai – Nhava Sheva (import) our rate is INR 2,280 per cubic metre, minimum one cubic metre, including origin CFS charges and documentation.</w:t>
+        <w:t xml:space="preserve">For LCL Nhava Sheva – Jebel Ali our rate is INR 1,990 per cubic metre all-in, minimum one cubic metre.</w:t>
+      </w:r>
+    </w:p>
+    <w:p>
+      <w:r>
+        <w:t xml:space="preserve">For LCL Nhava Sheva – Singapore our rate is INR 2,490 per cubic metre all-in, minimum one cubic metre.</w:t>
+      </w:r>
+    </w:p>
+    <w:p>
+      <w:r>
+        <w:t xml:space="preserve">For LCL Chennai – Singapore our rate is INR 2,320 per cubic metre all-in, minimum one cubic metre.</w:t>
+      </w:r>
+    </w:p>
+    <w:p>
+      <w:r>
+        <w:t xml:space="preserve">For LCL Nhava Sheva – Rotterdam our rate is INR 3,950 per cubic metre all-in, minimum one cubic metre.</w:t>
+      </w:r>
+    </w:p>
+    <w:p>
+      <w:r>
+        <w:t xml:space="preserve">For LCL Mundra – Hamburg our rate is INR 3,860 per cubic metre all-in, minimum one cubic metre.</w:t>
+      </w:r>
+    </w:p>
+    <w:p>
+      <w:r>
+        <w:t xml:space="preserve">For LCL Singapore – Nhava Sheva (import) our rate is INR 2,640 per cubic metre all-in, minimum one cubic metre.</w:t>
+      </w:r>
+    </w:p>
+    <w:p>
+      <w:r>
+        <w:t xml:space="preserve">For LCL Shanghai – Nhava Sheva (import) our rate is INR 2,280 per cubic metre all-in, minimum one cubic metre.</w:t>
       </w:r>
     </w:p>
     <w:p>

</xml_diff>

<commit_message>
Fixtures: regional price strengths so a split award beats a single award
</commit_message>
<xml_diff>
--- a/data/vendor_docs/vendor-C-word-prose.docx
+++ b/data/vendor_docs/vendor-C-word-prose.docx
@@ -59,27 +59,27 @@
     </w:p>
     <w:p>
       <w:r>
-        <w:t xml:space="preserve">For Nhava Sheva – Singapore we can offer INR 37,400 per twenty-foot standard container all-in, transit approximately 14 days, 10 free days at destination.</w:t>
-      </w:r>
-    </w:p>
-    <w:p>
-      <w:r>
-        <w:t xml:space="preserve">For Nhava Sheva – Singapore we can offer INR 56,100 per forty-foot high cube container all-in, transit approximately 14 days, 10 free days at destination.</w:t>
-      </w:r>
-    </w:p>
-    <w:p>
-      <w:r>
-        <w:t xml:space="preserve">For Nhava Sheva – Rotterdam we can offer INR 1,59,800 per forty-foot high cube container all-in, transit approximately 28 days, 10 free days at destination.</w:t>
-      </w:r>
-    </w:p>
-    <w:p>
-      <w:r>
-        <w:t xml:space="preserve">For Mundra – Rotterdam we can offer INR 1,57,000 per forty-foot high cube container all-in, transit approximately 29 days, 10 free days at destination.</w:t>
-      </w:r>
-    </w:p>
-    <w:p>
-      <w:r>
-        <w:t xml:space="preserve">For Nhava Sheva – Los Angeles we can offer INR 2,29,000 per forty-foot high cube container all-in, transit approximately 36 days, 10 free days at destination.</w:t>
+        <w:t xml:space="preserve">For Nhava Sheva – Singapore we can offer INR 37,800 per twenty-foot standard container all-in, transit approximately 14 days, 10 free days at destination.</w:t>
+      </w:r>
+    </w:p>
+    <w:p>
+      <w:r>
+        <w:t xml:space="preserve">For Nhava Sheva – Singapore we can offer INR 56,500 per forty-foot high cube container all-in, transit approximately 14 days, 10 free days at destination.</w:t>
+      </w:r>
+    </w:p>
+    <w:p>
+      <w:r>
+        <w:t xml:space="preserve">For Nhava Sheva – Rotterdam we can offer INR 1,52,000 per forty-foot high cube container all-in, transit approximately 28 days, 10 free days at destination.</w:t>
+      </w:r>
+    </w:p>
+    <w:p>
+      <w:r>
+        <w:t xml:space="preserve">For Mundra – Rotterdam we can offer INR 1,49,500 per forty-foot high cube container all-in, transit approximately 29 days, 10 free days at destination.</w:t>
+      </w:r>
+    </w:p>
+    <w:p>
+      <w:r>
+        <w:t xml:space="preserve">For Nhava Sheva – Los Angeles we can offer INR 2,18,000 per forty-foot high cube container all-in, transit approximately 36 days, 10 free days at destination.</w:t>
       </w:r>
     </w:p>
     <w:p>
@@ -89,12 +89,12 @@
     </w:p>
     <w:p>
       <w:r>
-        <w:t xml:space="preserve">For Nhava Sheva – Hamburg we can offer INR 1,64,000 per forty-foot high cube container all-in, transit approximately 30 days, 10 free days at destination.</w:t>
-      </w:r>
-    </w:p>
-    <w:p>
-      <w:r>
-        <w:t xml:space="preserve">For Nhava Sheva – Felixstowe we can offer INR 1,67,500 per forty-foot high cube container all-in, transit approximately 29 days, 10 free days at destination.</w:t>
+        <w:t xml:space="preserve">For Nhava Sheva – Hamburg we can offer INR 1,56,500 per forty-foot high cube container all-in, transit approximately 30 days, 10 free days at destination.</w:t>
+      </w:r>
+    </w:p>
+    <w:p>
+      <w:r>
+        <w:t xml:space="preserve">For Nhava Sheva – Felixstowe we can offer INR 1,60,000 per forty-foot high cube container all-in, transit approximately 29 days, 10 free days at destination.</w:t>
       </w:r>
     </w:p>
     <w:p>
@@ -104,7 +104,7 @@
     </w:p>
     <w:p>
       <w:r>
-        <w:t xml:space="preserve">For Shanghai – Nhava Sheva (import) we can offer INR 95,900 per forty-foot high cube container all-in, transit approximately 16 days, 10 free days at destination.</w:t>
+        <w:t xml:space="preserve">For Shanghai – Nhava Sheva (import) we can offer INR 91,000 per forty-foot high cube container all-in, transit approximately 16 days, 10 free days at destination.</w:t>
       </w:r>
     </w:p>
     <w:p>
@@ -114,7 +114,7 @@
     </w:p>
     <w:p>
       <w:r>
-        <w:t xml:space="preserve">For Busan – Chennai (import) we can offer INR 91,800 per forty-foot high cube container all-in, transit approximately 18 days, 10 free days at destination.</w:t>
+        <w:t xml:space="preserve">For Busan – Chennai (import) we can offer INR 87,500 per forty-foot high cube container all-in, transit approximately 18 days, 10 free days at destination.</w:t>
       </w:r>
     </w:p>
     <w:p>
@@ -147,12 +147,12 @@
     </w:p>
     <w:p>
       <w:r>
-        <w:t xml:space="preserve">For LCL Nhava Sheva – Rotterdam our rate is INR 3,950 per cubic metre all-in, minimum one cubic metre.</w:t>
-      </w:r>
-    </w:p>
-    <w:p>
-      <w:r>
-        <w:t xml:space="preserve">For LCL Mundra – Hamburg our rate is INR 3,860 per cubic metre all-in, minimum one cubic metre.</w:t>
+        <w:t xml:space="preserve">For LCL Nhava Sheva – Rotterdam our rate is INR 3,750 per cubic metre all-in, minimum one cubic metre.</w:t>
+      </w:r>
+    </w:p>
+    <w:p>
+      <w:r>
+        <w:t xml:space="preserve">For LCL Mundra – Hamburg our rate is INR 3,600 per cubic metre all-in, minimum one cubic metre.</w:t>
       </w:r>
     </w:p>
     <w:p>
@@ -175,7 +175,7 @@
     </w:p>
     <w:p>
       <w:r>
-        <w:t xml:space="preserve">Air freight Mumbai (BOM) – Dubai (DXB): INR 126 per chargeable kilogram, minimum 100 kg, transit 3 days.</w:t>
+        <w:t xml:space="preserve">Air freight Mumbai (BOM) – Dubai (DXB): INR 127 per chargeable kilogram, minimum 100 kg, transit 3 days.</w:t>
       </w:r>
     </w:p>
     <w:p>

</xml_diff>